<commit_message>
Revise manuscript Figure 1: lead with the confound result (drop study-design schematic)
Per author preference, replaced the Figure 1 study-design schematic with a data figure:
the H-Optimus-0 embedding-control bar chart (HER2-low-vs-zero balanced accuracy, GigaTIME
vs generic embedding vs slide-size/source-site baselines, repeated-CV vs leave-source-site-out)
now leads as Figure 1. Renumbered Figures 2-6 -> 1-5 (in-text references and figure list),
removed the schematic script/asset, and rebuilt the Word render.

Co-Authored-By: Claude Opus 4.8 <noreply@anthropic.com>
</commit_message>
<xml_diff>
--- a/docs/manuscript_draft.docx
+++ b/docs/manuscript_draft.docx
@@ -460,7 +460,7 @@
         <w:t xml:space="preserve"> </w:t>
       </w:r>
       <w:r>
-        <w:t xml:space="preserve">narrative is not required to explain the low-versus-zero axis: it is generic morphology tracking TCGA acquisition structure (Figure 2, Table 1).</w:t>
+        <w:t xml:space="preserve">narrative is not required to explain the low-versus-zero axis: it is generic morphology tracking TCGA acquisition structure (Figure 1, Table 1).</w:t>
       </w:r>
     </w:p>
     <w:bookmarkEnd w:id="12"/>
@@ -605,7 +605,7 @@
         <w:pStyle w:val="BodyText"/>
       </w:pPr>
       <w:r>
-        <w:t xml:space="preserve">After cellularity control, channel-specific signal was the exception, not the rule (Figure 4). Aggregating across sections: the</w:t>
+        <w:t xml:space="preserve">After cellularity control, channel-specific signal was the exception, not the rule (Figure 3). Aggregating across sections: the</w:t>
       </w:r>
       <w:r>
         <w:t xml:space="preserve"> </w:t>
@@ -671,7 +671,7 @@
         <w:t xml:space="preserve"> </w:t>
       </w:r>
       <w:r>
-        <w:t xml:space="preserve">(Figure 6). Agreement with the training modality does not predict specificity against an independent one.</w:t>
+        <w:t xml:space="preserve">(Figure 5). Agreement with the training modality does not predict specificity against an independent one.</w:t>
       </w:r>
     </w:p>
     <w:bookmarkEnd w:id="14"/>
@@ -759,7 +759,7 @@
         <w:t xml:space="preserve"> </w:t>
       </w:r>
       <w:r>
-        <w:t xml:space="preserve">channel×sample measurements. Only the T-cell channels (CD8, and CD4 where measured) were reliably shared; GigaTIME additionally recovered CD3/CD11c/CK, whereas ROSIE instead recovered CD14/CD68 (Figure 5). Because two independent models give different per-channel answers on the same tissue, no single model’s virtual channels can be trusted as quantitative cell-type readouts. (Both models are applied out-of-domain to breast — GigaTIME trained on lung, ROSIE on colorectal — a fair, like-for-like cross-organ comparison.)</w:t>
+        <w:t xml:space="preserve">channel×sample measurements. Only the T-cell channels (CD8, and CD4 where measured) were reliably shared; GigaTIME additionally recovered CD3/CD11c/CK, whereas ROSIE instead recovered CD14/CD68 (Figure 4). Because two independent models give different per-channel answers on the same tissue, no single model’s virtual channels can be trusted as quantitative cell-type readouts. (Both models are applied out-of-domain to breast — GigaTIME trained on lung, ROSIE on colorectal — a fair, like-for-like cross-organ comparison.)</w:t>
       </w:r>
     </w:p>
     <w:bookmarkEnd w:id="15"/>
@@ -1306,7 +1306,7 @@
         <w:t xml:space="preserve"> </w:t>
       </w:r>
       <w:r>
-        <w:t xml:space="preserve">Study design: the apparent biomarker and the four falsification tests (confound baselines, generic embeddings, external single-scanner cohort, independent-modality specificity audit + second model).</w:t>
+        <w:t xml:space="preserve">The confound, in one panel. HER2-low-vs-zero balanced accuracy for GigaTIME virtual channels vs a generic foundation-model embedding (H-Optimus-0) vs slide-size and source-site baselines, under repeated cross-validation versus leave-source-site-out. Slide-size stays high under both validations; the image features collapse under source-site holdout. (Virchow2 replicates — Table 1.)</w:t>
       </w:r>
       <w:r>
         <w:t xml:space="preserve"> </w:t>
@@ -1315,7 +1315,7 @@
         <w:rPr>
           <w:rStyle w:val="VerbatimChar"/>
         </w:rPr>
-        <w:t xml:space="preserve">docs/assets/manuscript/figure1_study_design.png</w:t>
+        <w:t xml:space="preserve">docs/assets/clinical_her2_high_trust_tile128_hoptimus_embedding_control/embedding_control_balanced_accuracy.png</w:t>
       </w:r>
     </w:p>
     <w:p>
@@ -1337,7 +1337,7 @@
         <w:t xml:space="preserve"> </w:t>
       </w:r>
       <w:r>
-        <w:t xml:space="preserve">HER2-low-vs-zero balanced accuracy: GigaTIME vs generic embeddings (H-Optimus-0, Virchow2) vs slide-size/source-site baselines, under repeated CV vs leave-source-site-out.</w:t>
+        <w:t xml:space="preserve">External single-scanner cohort (BCNB): two-model performance and concordance.</w:t>
       </w:r>
       <w:r>
         <w:t xml:space="preserve"> </w:t>
@@ -1346,7 +1346,7 @@
         <w:rPr>
           <w:rStyle w:val="VerbatimChar"/>
         </w:rPr>
-        <w:t xml:space="preserve">docs/assets/clinical_her2_high_trust_tile128_hoptimus_embedding_control/embedding_control_balanced_accuracy.png</w:t>
+        <w:t xml:space="preserve">docs/assets/bcnb_patch_model_comparison_hoptimus0_virchow2_hash_capped10_low_zero/bcnb_patch_model_comparison_metrics.png</w:t>
       </w:r>
     </w:p>
     <w:p>
@@ -1368,7 +1368,7 @@
         <w:t xml:space="preserve"> </w:t>
       </w:r>
       <w:r>
-        <w:t xml:space="preserve">External single-scanner (BCNB) performance and covariate attenuation across grade/receptor/subtype strata.</w:t>
+        <w:t xml:space="preserve">Cross-sample virtual-channel RNA specificity (cellularity-controlled partial r; 9 sections × 2 platforms).</w:t>
       </w:r>
       <w:r>
         <w:t xml:space="preserve"> </w:t>
@@ -1377,22 +1377,7 @@
         <w:rPr>
           <w:rStyle w:val="VerbatimChar"/>
         </w:rPr>
-        <w:t xml:space="preserve">docs/assets/bcnb_patch_score_covariate_drivers_*</w:t>
-      </w:r>
-      <w:r>
-        <w:t xml:space="preserve"> </w:t>
-      </w:r>
-      <w:r>
-        <w:t xml:space="preserve">/</w:t>
-      </w:r>
-      <w:r>
-        <w:t xml:space="preserve"> </w:t>
-      </w:r>
-      <w:r>
-        <w:rPr>
-          <w:rStyle w:val="VerbatimChar"/>
-        </w:rPr>
-        <w:t xml:space="preserve">..._stratified_performance_*</w:t>
+        <w:t xml:space="preserve">docs/assets/hest_rna_validation_summary/cross_sample_partial_r.png</w:t>
       </w:r>
     </w:p>
     <w:p>
@@ -1414,7 +1399,7 @@
         <w:t xml:space="preserve"> </w:t>
       </w:r>
       <w:r>
-        <w:t xml:space="preserve">Cross-sample virtual-channel RNA specificity (cellularity-controlled partial r; 9 sections × 2 platforms).</w:t>
+        <w:t xml:space="preserve">Two-model comparison (GigaTIME vs ROSIE) per channel × sample; the models disagree (concordance r=0.12).</w:t>
       </w:r>
       <w:r>
         <w:t xml:space="preserve"> </w:t>
@@ -1423,7 +1408,19 @@
         <w:rPr>
           <w:rStyle w:val="VerbatimChar"/>
         </w:rPr>
-        <w:t xml:space="preserve">docs/assets/hest_rna_validation_summary/cross_sample_partial_r.png</w:t>
+        <w:t xml:space="preserve">docs/assets/gigatime_vs_rosie_field_level/gigatime_partial_r.png</w:t>
+      </w:r>
+      <w:r>
+        <w:t xml:space="preserve">,</w:t>
+      </w:r>
+      <w:r>
+        <w:t xml:space="preserve"> </w:t>
+      </w:r>
+      <w:r>
+        <w:rPr>
+          <w:rStyle w:val="VerbatimChar"/>
+        </w:rPr>
+        <w:t xml:space="preserve">..._rosie_partial_r.png</w:t>
       </w:r>
     </w:p>
     <w:p>
@@ -1445,7 +1442,7 @@
         <w:t xml:space="preserve"> </w:t>
       </w:r>
       <w:r>
-        <w:t xml:space="preserve">Two-model comparison (GigaTIME vs ROSIE) per channel × sample; the models disagree.</w:t>
+        <w:t xml:space="preserve">GigaTIME measured-mIF agreement (recomputed) vs independent RNA specificity: agreement does not predict specificity.</w:t>
       </w:r>
       <w:r>
         <w:t xml:space="preserve"> </w:t>
@@ -1454,19 +1451,7 @@
         <w:rPr>
           <w:rStyle w:val="VerbatimChar"/>
         </w:rPr>
-        <w:t xml:space="preserve">docs/assets/gigatime_vs_rosie_field_level/gigatime_partial_r.png</w:t>
-      </w:r>
-      <w:r>
-        <w:t xml:space="preserve">,</w:t>
-      </w:r>
-      <w:r>
-        <w:t xml:space="preserve"> </w:t>
-      </w:r>
-      <w:r>
-        <w:rPr>
-          <w:rStyle w:val="VerbatimChar"/>
-        </w:rPr>
-        <w:t xml:space="preserve">..._rosie_partial_r.png</w:t>
+        <w:t xml:space="preserve">docs/assets/gigatime_vs_rna_specificity/mif_agreement_vs_rna_specificity_scatter.png</w:t>
       </w:r>
     </w:p>
     <w:p>
@@ -1482,37 +1467,6 @@
           <w:b/>
           <w:bCs/>
         </w:rPr>
-        <w:t xml:space="preserve">Figure 6.</w:t>
-      </w:r>
-      <w:r>
-        <w:t xml:space="preserve"> </w:t>
-      </w:r>
-      <w:r>
-        <w:t xml:space="preserve">GigaTIME measured-mIF agreement (recomputed) vs independent RNA specificity: agreement does not predict specificity.</w:t>
-      </w:r>
-      <w:r>
-        <w:t xml:space="preserve"> </w:t>
-      </w:r>
-      <w:r>
-        <w:rPr>
-          <w:rStyle w:val="VerbatimChar"/>
-        </w:rPr>
-        <w:t xml:space="preserve">docs/assets/gigatime_vs_rna_specificity/mif_agreement_vs_rna_specificity_scatter.png</w:t>
-      </w:r>
-    </w:p>
-    <w:p>
-      <w:pPr>
-        <w:pStyle w:val="Compact"/>
-        <w:numPr>
-          <w:ilvl w:val="0"/>
-          <w:numId w:val="1001"/>
-        </w:numPr>
-      </w:pPr>
-      <w:r>
-        <w:rPr>
-          <w:b/>
-          <w:bCs/>
-        </w:rPr>
         <w:t xml:space="preserve">Table 1.</w:t>
       </w:r>
       <w:r>
@@ -1852,7 +1806,7 @@
     </w:p>
     <w:bookmarkEnd w:id="22"/>
     <w:bookmarkEnd w:id="23"/>
-    <w:bookmarkStart w:id="45" w:name="table-1-and-figures-rendered"/>
+    <w:bookmarkStart w:id="42" w:name="table-1-and-figures-rendered"/>
     <w:p>
       <w:pPr>
         <w:pStyle w:val="Heading1"/>
@@ -2086,85 +2040,20 @@
       <w:r>
         <w:drawing>
           <wp:inline>
-            <wp:extent cx="5334000" cy="6308153"/>
+            <wp:extent cx="5334000" cy="2712796"/>
             <wp:effectExtent b="0" l="0" r="0" t="0"/>
-            <wp:docPr descr="Figure 1. Study design: the apparent biomarker and the four falsification tests." title="" id="25" name="Picture"/>
+            <wp:docPr descr="Figure 1. The confound in one panel: HER2-low-vs-zero balanced accuracy for GigaTIME virtual channels vs a generic foundation-model embedding (H-Optimus-0) vs slide-size and source-site baselines, under repeated cross-validation versus leave-source-site-out. Slide-size stays high under both; the image features collapse under source-site holdout." title="" id="25" name="Picture"/>
             <a:graphic>
               <a:graphicData uri="http://schemas.openxmlformats.org/drawingml/2006/picture">
                 <pic:pic>
                   <pic:nvPicPr>
-                    <pic:cNvPr descr="/Users/marjoripomarole/projects/brca-her2-pathology-ai/docs/assets/manuscript/figure1_study_design.png" id="26" name="Picture"/>
+                    <pic:cNvPr descr="/Users/marjoripomarole/projects/brca-her2-pathology-ai/docs/assets/clinical_her2_high_trust_tile128_hoptimus_embedding_control/embedding_control_balanced_accuracy.png" id="26" name="Picture"/>
                     <pic:cNvPicPr>
                       <a:picLocks noChangeArrowheads="1" noChangeAspect="1"/>
                     </pic:cNvPicPr>
                   </pic:nvPicPr>
                   <pic:blipFill>
                     <a:blip r:embed="rId24"/>
-                    <a:stretch>
-                      <a:fillRect/>
-                    </a:stretch>
-                  </pic:blipFill>
-                  <pic:spPr bwMode="auto">
-                    <a:xfrm>
-                      <a:off x="0" y="0"/>
-                      <a:ext cx="5334000" cy="6308153"/>
-                    </a:xfrm>
-                    <a:prstGeom prst="rect">
-                      <a:avLst/>
-                    </a:prstGeom>
-                    <a:noFill/>
-                    <a:ln w="9525">
-                      <a:noFill/>
-                      <a:headEnd/>
-                      <a:tailEnd/>
-                    </a:ln>
-                  </pic:spPr>
-                </pic:pic>
-              </a:graphicData>
-            </a:graphic>
-          </wp:inline>
-        </w:drawing>
-      </w:r>
-    </w:p>
-    <w:p>
-      <w:pPr>
-        <w:pStyle w:val="ImageCaption"/>
-      </w:pPr>
-      <w:r>
-        <w:rPr>
-          <w:b/>
-          <w:bCs/>
-        </w:rPr>
-        <w:t xml:space="preserve">Figure 1.</w:t>
-      </w:r>
-      <w:r>
-        <w:t xml:space="preserve"> </w:t>
-      </w:r>
-      <w:r>
-        <w:t xml:space="preserve">Study design: the apparent biomarker and the four falsification tests.</w:t>
-      </w:r>
-    </w:p>
-    <w:p>
-      <w:pPr>
-        <w:pStyle w:val="CaptionedFigure"/>
-      </w:pPr>
-      <w:r>
-        <w:drawing>
-          <wp:inline>
-            <wp:extent cx="5334000" cy="2712796"/>
-            <wp:effectExtent b="0" l="0" r="0" t="0"/>
-            <wp:docPr descr="Figure 2. HER2-low-vs-zero balanced accuracy: GigaTIME vs generic embeddings (H-Optimus-0, Virchow2) vs slide-size/source-site baselines, under repeated CV vs leave-source-site-out." title="" id="28" name="Picture"/>
-            <a:graphic>
-              <a:graphicData uri="http://schemas.openxmlformats.org/drawingml/2006/picture">
-                <pic:pic>
-                  <pic:nvPicPr>
-                    <pic:cNvPr descr="/Users/marjoripomarole/projects/brca-her2-pathology-ai/docs/assets/clinical_her2_high_trust_tile128_hoptimus_embedding_control/embedding_control_balanced_accuracy.png" id="29" name="Picture"/>
-                    <pic:cNvPicPr>
-                      <a:picLocks noChangeArrowheads="1" noChangeAspect="1"/>
-                    </pic:cNvPicPr>
-                  </pic:nvPicPr>
-                  <pic:blipFill>
-                    <a:blip r:embed="rId27"/>
                     <a:stretch>
                       <a:fillRect/>
                     </a:stretch>
@@ -2200,13 +2089,13 @@
           <w:b/>
           <w:bCs/>
         </w:rPr>
-        <w:t xml:space="preserve">Figure 2.</w:t>
-      </w:r>
-      <w:r>
-        <w:t xml:space="preserve"> </w:t>
-      </w:r>
-      <w:r>
-        <w:t xml:space="preserve">HER2-low-vs-zero balanced accuracy: GigaTIME vs generic embeddings (H-Optimus-0, Virchow2) vs slide-size/source-site baselines, under repeated CV vs leave-source-site-out.</w:t>
+        <w:t xml:space="preserve">Figure 1.</w:t>
+      </w:r>
+      <w:r>
+        <w:t xml:space="preserve"> </w:t>
+      </w:r>
+      <w:r>
+        <w:t xml:space="preserve">The confound in one panel: HER2-low-vs-zero balanced accuracy for GigaTIME virtual channels vs a generic foundation-model embedding (H-Optimus-0) vs slide-size and source-site baselines, under repeated cross-validation versus leave-source-site-out. Slide-size stays high under both; the image features collapse under source-site holdout.</w:t>
       </w:r>
     </w:p>
     <w:p>
@@ -2218,18 +2107,18 @@
           <wp:inline>
             <wp:extent cx="5334000" cy="2526338"/>
             <wp:effectExtent b="0" l="0" r="0" t="0"/>
-            <wp:docPr descr="Figure 3. External single-scanner cohort (BCNB): two-model performance and concordance." title="" id="31" name="Picture"/>
+            <wp:docPr descr="Figure 2. External single-scanner cohort (BCNB): two-model performance and concordance." title="" id="28" name="Picture"/>
             <a:graphic>
               <a:graphicData uri="http://schemas.openxmlformats.org/drawingml/2006/picture">
                 <pic:pic>
                   <pic:nvPicPr>
-                    <pic:cNvPr descr="/Users/marjoripomarole/projects/brca-her2-pathology-ai/docs/assets/bcnb_patch_model_comparison_hoptimus0_virchow2_hash_capped10_low_zero/bcnb_patch_model_comparison_metrics.png" id="32" name="Picture"/>
+                    <pic:cNvPr descr="/Users/marjoripomarole/projects/brca-her2-pathology-ai/docs/assets/bcnb_patch_model_comparison_hoptimus0_virchow2_hash_capped10_low_zero/bcnb_patch_model_comparison_metrics.png" id="29" name="Picture"/>
                     <pic:cNvPicPr>
                       <a:picLocks noChangeArrowheads="1" noChangeAspect="1"/>
                     </pic:cNvPicPr>
                   </pic:nvPicPr>
                   <pic:blipFill>
-                    <a:blip r:embed="rId30"/>
+                    <a:blip r:embed="rId27"/>
                     <a:stretch>
                       <a:fillRect/>
                     </a:stretch>
@@ -2265,7 +2154,7 @@
           <w:b/>
           <w:bCs/>
         </w:rPr>
-        <w:t xml:space="preserve">Figure 3.</w:t>
+        <w:t xml:space="preserve">Figure 2.</w:t>
       </w:r>
       <w:r>
         <w:t xml:space="preserve"> </w:t>
@@ -2283,18 +2172,18 @@
           <wp:inline>
             <wp:extent cx="5334000" cy="5010018"/>
             <wp:effectExtent b="0" l="0" r="0" t="0"/>
-            <wp:docPr descr="Figure 4. Cross-sample virtual-channel RNA specificity (cellularity-controlled partial r; 9 sections, 2 platforms)." title="" id="34" name="Picture"/>
+            <wp:docPr descr="Figure 3. Cross-sample virtual-channel RNA specificity (cellularity-controlled partial r; 9 sections, 2 platforms)." title="" id="31" name="Picture"/>
             <a:graphic>
               <a:graphicData uri="http://schemas.openxmlformats.org/drawingml/2006/picture">
                 <pic:pic>
                   <pic:nvPicPr>
-                    <pic:cNvPr descr="/Users/marjoripomarole/projects/brca-her2-pathology-ai/docs/assets/hest_rna_validation_summary/cross_sample_partial_r.png" id="35" name="Picture"/>
+                    <pic:cNvPr descr="/Users/marjoripomarole/projects/brca-her2-pathology-ai/docs/assets/hest_rna_validation_summary/cross_sample_partial_r.png" id="32" name="Picture"/>
                     <pic:cNvPicPr>
                       <a:picLocks noChangeArrowheads="1" noChangeAspect="1"/>
                     </pic:cNvPicPr>
                   </pic:nvPicPr>
                   <pic:blipFill>
-                    <a:blip r:embed="rId33"/>
+                    <a:blip r:embed="rId30"/>
                     <a:stretch>
                       <a:fillRect/>
                     </a:stretch>
@@ -2330,7 +2219,7 @@
           <w:b/>
           <w:bCs/>
         </w:rPr>
-        <w:t xml:space="preserve">Figure 4.</w:t>
+        <w:t xml:space="preserve">Figure 3.</w:t>
       </w:r>
       <w:r>
         <w:t xml:space="preserve"> </w:t>
@@ -2348,12 +2237,77 @@
           <wp:inline>
             <wp:extent cx="5334000" cy="5229411"/>
             <wp:effectExtent b="0" l="0" r="0" t="0"/>
-            <wp:docPr descr="Figure 5a. GigaTIME per-channel RNA specificity across samples." title="" id="37" name="Picture"/>
+            <wp:docPr descr="Figure 4a. GigaTIME per-channel RNA specificity across samples." title="" id="34" name="Picture"/>
             <a:graphic>
               <a:graphicData uri="http://schemas.openxmlformats.org/drawingml/2006/picture">
                 <pic:pic>
                   <pic:nvPicPr>
-                    <pic:cNvPr descr="/Users/marjoripomarole/projects/brca-her2-pathology-ai/docs/assets/gigatime_vs_rosie_field_level/gigatime_partial_r.png" id="38" name="Picture"/>
+                    <pic:cNvPr descr="/Users/marjoripomarole/projects/brca-her2-pathology-ai/docs/assets/gigatime_vs_rosie_field_level/gigatime_partial_r.png" id="35" name="Picture"/>
+                    <pic:cNvPicPr>
+                      <a:picLocks noChangeArrowheads="1" noChangeAspect="1"/>
+                    </pic:cNvPicPr>
+                  </pic:nvPicPr>
+                  <pic:blipFill>
+                    <a:blip r:embed="rId33"/>
+                    <a:stretch>
+                      <a:fillRect/>
+                    </a:stretch>
+                  </pic:blipFill>
+                  <pic:spPr bwMode="auto">
+                    <a:xfrm>
+                      <a:off x="0" y="0"/>
+                      <a:ext cx="5334000" cy="5229411"/>
+                    </a:xfrm>
+                    <a:prstGeom prst="rect">
+                      <a:avLst/>
+                    </a:prstGeom>
+                    <a:noFill/>
+                    <a:ln w="9525">
+                      <a:noFill/>
+                      <a:headEnd/>
+                      <a:tailEnd/>
+                    </a:ln>
+                  </pic:spPr>
+                </pic:pic>
+              </a:graphicData>
+            </a:graphic>
+          </wp:inline>
+        </w:drawing>
+      </w:r>
+    </w:p>
+    <w:p>
+      <w:pPr>
+        <w:pStyle w:val="ImageCaption"/>
+      </w:pPr>
+      <w:r>
+        <w:rPr>
+          <w:b/>
+          <w:bCs/>
+        </w:rPr>
+        <w:t xml:space="preserve">Figure 4a.</w:t>
+      </w:r>
+      <w:r>
+        <w:t xml:space="preserve"> </w:t>
+      </w:r>
+      <w:r>
+        <w:t xml:space="preserve">GigaTIME per-channel RNA specificity across samples.</w:t>
+      </w:r>
+    </w:p>
+    <w:p>
+      <w:pPr>
+        <w:pStyle w:val="CaptionedFigure"/>
+      </w:pPr>
+      <w:r>
+        <w:drawing>
+          <wp:inline>
+            <wp:extent cx="5334000" cy="5229411"/>
+            <wp:effectExtent b="0" l="0" r="0" t="0"/>
+            <wp:docPr descr="Figure 4b. ROSIE per-channel RNA specificity across samples — the two models disagree (concordance r=0.12)." title="" id="37" name="Picture"/>
+            <a:graphic>
+              <a:graphicData uri="http://schemas.openxmlformats.org/drawingml/2006/picture">
+                <pic:pic>
+                  <pic:nvPicPr>
+                    <pic:cNvPr descr="/Users/marjoripomarole/projects/brca-her2-pathology-ai/docs/assets/gigatime_vs_rosie_field_level/rosie_partial_r.png" id="38" name="Picture"/>
                     <pic:cNvPicPr>
                       <a:picLocks noChangeArrowheads="1" noChangeAspect="1"/>
                     </pic:cNvPicPr>
@@ -2395,13 +2349,13 @@
           <w:b/>
           <w:bCs/>
         </w:rPr>
-        <w:t xml:space="preserve">Figure 5a.</w:t>
-      </w:r>
-      <w:r>
-        <w:t xml:space="preserve"> </w:t>
-      </w:r>
-      <w:r>
-        <w:t xml:space="preserve">GigaTIME per-channel RNA specificity across samples.</w:t>
+        <w:t xml:space="preserve">Figure 4b.</w:t>
+      </w:r>
+      <w:r>
+        <w:t xml:space="preserve"> </w:t>
+      </w:r>
+      <w:r>
+        <w:t xml:space="preserve">ROSIE per-channel RNA specificity across samples — the two models disagree (concordance r=0.12).</w:t>
       </w:r>
     </w:p>
     <w:p>
@@ -2411,85 +2365,20 @@
       <w:r>
         <w:drawing>
           <wp:inline>
-            <wp:extent cx="5334000" cy="5229411"/>
+            <wp:extent cx="5334000" cy="4445000"/>
             <wp:effectExtent b="0" l="0" r="0" t="0"/>
-            <wp:docPr descr="Figure 5b. ROSIE per-channel RNA specificity across samples — the two models disagree (concordance r=0.12)." title="" id="40" name="Picture"/>
+            <wp:docPr descr="Figure 5. GigaTIME measured-mIF agreement (recomputed) vs independent RNA specificity: agreement does not predict specificity." title="" id="40" name="Picture"/>
             <a:graphic>
               <a:graphicData uri="http://schemas.openxmlformats.org/drawingml/2006/picture">
                 <pic:pic>
                   <pic:nvPicPr>
-                    <pic:cNvPr descr="/Users/marjoripomarole/projects/brca-her2-pathology-ai/docs/assets/gigatime_vs_rosie_field_level/rosie_partial_r.png" id="41" name="Picture"/>
+                    <pic:cNvPr descr="/Users/marjoripomarole/projects/brca-her2-pathology-ai/docs/assets/gigatime_vs_rna_specificity/mif_agreement_vs_rna_specificity_scatter.png" id="41" name="Picture"/>
                     <pic:cNvPicPr>
                       <a:picLocks noChangeArrowheads="1" noChangeAspect="1"/>
                     </pic:cNvPicPr>
                   </pic:nvPicPr>
                   <pic:blipFill>
                     <a:blip r:embed="rId39"/>
-                    <a:stretch>
-                      <a:fillRect/>
-                    </a:stretch>
-                  </pic:blipFill>
-                  <pic:spPr bwMode="auto">
-                    <a:xfrm>
-                      <a:off x="0" y="0"/>
-                      <a:ext cx="5334000" cy="5229411"/>
-                    </a:xfrm>
-                    <a:prstGeom prst="rect">
-                      <a:avLst/>
-                    </a:prstGeom>
-                    <a:noFill/>
-                    <a:ln w="9525">
-                      <a:noFill/>
-                      <a:headEnd/>
-                      <a:tailEnd/>
-                    </a:ln>
-                  </pic:spPr>
-                </pic:pic>
-              </a:graphicData>
-            </a:graphic>
-          </wp:inline>
-        </w:drawing>
-      </w:r>
-    </w:p>
-    <w:p>
-      <w:pPr>
-        <w:pStyle w:val="ImageCaption"/>
-      </w:pPr>
-      <w:r>
-        <w:rPr>
-          <w:b/>
-          <w:bCs/>
-        </w:rPr>
-        <w:t xml:space="preserve">Figure 5b.</w:t>
-      </w:r>
-      <w:r>
-        <w:t xml:space="preserve"> </w:t>
-      </w:r>
-      <w:r>
-        <w:t xml:space="preserve">ROSIE per-channel RNA specificity across samples — the two models disagree (concordance r=0.12).</w:t>
-      </w:r>
-    </w:p>
-    <w:p>
-      <w:pPr>
-        <w:pStyle w:val="CaptionedFigure"/>
-      </w:pPr>
-      <w:r>
-        <w:drawing>
-          <wp:inline>
-            <wp:extent cx="5334000" cy="4445000"/>
-            <wp:effectExtent b="0" l="0" r="0" t="0"/>
-            <wp:docPr descr="Figure 6. GigaTIME measured-mIF agreement (recomputed) vs independent RNA specificity: agreement does not predict specificity." title="" id="43" name="Picture"/>
-            <a:graphic>
-              <a:graphicData uri="http://schemas.openxmlformats.org/drawingml/2006/picture">
-                <pic:pic>
-                  <pic:nvPicPr>
-                    <pic:cNvPr descr="/Users/marjoripomarole/projects/brca-her2-pathology-ai/docs/assets/gigatime_vs_rna_specificity/mif_agreement_vs_rna_specificity_scatter.png" id="44" name="Picture"/>
-                    <pic:cNvPicPr>
-                      <a:picLocks noChangeArrowheads="1" noChangeAspect="1"/>
-                    </pic:cNvPicPr>
-                  </pic:nvPicPr>
-                  <pic:blipFill>
-                    <a:blip r:embed="rId42"/>
                     <a:stretch>
                       <a:fillRect/>
                     </a:stretch>
@@ -2525,7 +2414,7 @@
           <w:b/>
           <w:bCs/>
         </w:rPr>
-        <w:t xml:space="preserve">Figure 6.</w:t>
+        <w:t xml:space="preserve">Figure 5.</w:t>
       </w:r>
       <w:r>
         <w:t xml:space="preserve"> </w:t>
@@ -2534,7 +2423,7 @@
         <w:t xml:space="preserve">GigaTIME measured-mIF agreement (recomputed) vs independent RNA specificity: agreement does not predict specificity.</w:t>
       </w:r>
     </w:p>
-    <w:bookmarkEnd w:id="45"/>
+    <w:bookmarkEnd w:id="42"/>
     <w:sectPr>
       <w:footnotePr>
         <w:numRestart w:val="eachSect"/>

</xml_diff>